<commit_message>
feat: 更新三合一單產出與 COA 邏輯修復 (2026-09-11 ~ 2026-09-12 彙整)
</commit_message>
<xml_diff>
--- a/三合一單自動產生器/三合一單與運輸通知表自動產生器_操作手冊.docx
+++ b/三合一單自動產生器/三合一單與運輸通知表自動產生器_操作手冊.docx
@@ -14,7 +14,7 @@
           <w:color w:val="002060"/>
           <w:sz w:val="44"/>
         </w:rPr>
-        <w:t>【操作指南】三合一單與運輸通知表自動產生器</w:t>
+        <w:t>三合一單與運輸通知表自動產生器</w:t>
         <w:br/>
         <w:t>圖文步驟操作手冊 (Illustrated User Manual)</w:t>
       </w:r>
@@ -26,11 +26,12 @@
       </w:pPr>
       <w:r>
         <w:rPr>
+          <w:rFonts w:ascii="Microsoft JhengHei" w:hAnsi="Microsoft JhengHei"/>
           <w:i/>
           <w:color w:val="666666"/>
           <w:sz w:val="19"/>
         </w:rPr>
-        <w:t>適用對象：現場、排程與物流作業人員 | 最新版本：v3.0 (含槽號檔名與圖文教學)</w:t>
+        <w:t>適用對象：現場、排程與物流作業人員 | 最新版本：v3.1 (含 COA 辨識、槽號檔名與故障排除)</w:t>
       </w:r>
     </w:p>
     <w:p>
@@ -49,7 +50,10 @@
     </w:p>
     <w:p>
       <w:r>
-        <w:t>本工具專為物流、排程與現場作業人員設計，提供直觀的桌面圖形介面 (GUI)，能自動完成槽號計算、二維條碼 (QR Code) 重新生成、日期時間拆分與同檔併排修正通知卡片產出。</w:t>
+        <w:rPr>
+          <w:rFonts w:ascii="Microsoft JhengHei" w:hAnsi="Microsoft JhengHei"/>
+        </w:rPr>
+        <w:t>本工具專為物流、排程與現場作業人員設計，提供直觀的桌面圖形介面 (GUI)，能自動完成槽號計算、二維條碼 (QR Code) 重新生成、COA 檢驗截圖自動 OCR 辨識貼入、日期時間拆分與同檔併排修正通知卡片產出。</w:t>
       </w:r>
     </w:p>
     <w:p>
@@ -59,13 +63,17 @@
       </w:pPr>
       <w:r>
         <w:rPr>
+          <w:rFonts w:ascii="Microsoft JhengHei" w:hAnsi="Microsoft JhengHei"/>
           <w:b/>
           <w:color w:val="002060"/>
         </w:rPr>
         <w:t>1. 獨立三合一單 Excel：</w:t>
       </w:r>
       <w:r>
-        <w:t>自動讀取對照表轉換長代號，自動根據 10 碼批號計算 3~4 码槽號與生成 QR Code 圖片。</w:t>
+        <w:rPr>
+          <w:rFonts w:ascii="Microsoft JhengHei" w:hAnsi="Microsoft JhengHei"/>
+        </w:rPr>
+        <w:t>自動讀取對照表轉換長代號，自動根據 10 碼批號計算 3~4 碼槽號與生成 QR Code 圖片。</w:t>
       </w:r>
     </w:p>
     <w:p>
@@ -75,13 +83,37 @@
       </w:pPr>
       <w:r>
         <w:rPr>
+          <w:rFonts w:ascii="Microsoft JhengHei" w:hAnsi="Microsoft JhengHei"/>
           <w:b/>
           <w:color w:val="002060"/>
         </w:rPr>
         <w:t>2. 運輸通知表 Excel：</w:t>
       </w:r>
       <w:r>
+        <w:rPr>
+          <w:rFonts w:ascii="Microsoft JhengHei" w:hAnsi="Microsoft JhengHei"/>
+        </w:rPr>
         <w:t>彙整排程卡片，預計時間與修正時間自動拆分，支援紅字加粗與刪除線併排修正卡片。</w:t>
+      </w:r>
+    </w:p>
+    <w:p>
+      <w:pPr>
+        <w:pStyle w:val="ListBullet"/>
+        <w:spacing w:after="80"/>
+      </w:pPr>
+      <w:r>
+        <w:rPr>
+          <w:rFonts w:ascii="Microsoft JhengHei" w:hAnsi="Microsoft JhengHei"/>
+          <w:b/>
+          <w:color w:val="002060"/>
+        </w:rPr>
+        <w:t>3. COA 檢驗智慧 OCR 辨識與裁切貼入：</w:t>
+      </w:r>
+      <w:r>
+        <w:rPr>
+          <w:rFonts w:ascii="Microsoft JhengHei" w:hAnsi="Microsoft JhengHei"/>
+        </w:rPr>
+        <w:t>支援一鍵上傳檢驗截圖，系統自動以 OCR 解析批號並精確裁切檢驗表頭與數據列，自動嵌入三合一單 F5 儲存格，免除人工剪貼。</w:t>
       </w:r>
     </w:p>
     <w:p>
@@ -114,6 +146,9 @@
     </w:p>
     <w:p>
       <w:r>
+        <w:rPr>
+          <w:rFonts w:ascii="Microsoft JhengHei" w:hAnsi="Microsoft JhengHei"/>
+        </w:rPr>
         <w:t>軟體開啟時會自動核對範本與地點對照表。若在對照表中新增了地點，無需關閉重開程式，直接點擊「重新載入對照表」按鈕即可即時刷新對照碼！</w:t>
       </w:r>
     </w:p>
@@ -134,7 +169,7 @@
               <a:graphicData uri="http://schemas.openxmlformats.org/drawingml/2006/picture">
                 <pic:pic>
                   <pic:nvPicPr>
-                    <pic:cNvPr id="0" name="step1.png"/>
+                    <pic:cNvPr id="0" name="image1.png"/>
                     <pic:cNvPicPr/>
                   </pic:nvPicPr>
                   <pic:blipFill>
@@ -164,6 +199,7 @@
       </w:pPr>
       <w:r>
         <w:rPr>
+          <w:rFonts w:ascii="Microsoft JhengHei" w:hAnsi="Microsoft JhengHei"/>
           <w:b/>
           <w:color w:val="C00000"/>
           <w:sz w:val="19"/>
@@ -187,6 +223,9 @@
     </w:p>
     <w:p>
       <w:r>
+        <w:rPr>
+          <w:rFonts w:ascii="Microsoft JhengHei" w:hAnsi="Microsoft JhengHei"/>
+        </w:rPr>
         <w:t>直接從 Excel 複製多筆資料，於「批號」輸入框按下 Ctrl+V。無論複製順序為【到貨/批號/槽號/地點】或【批號/地點/日期/時間】，系統均能智慧精準歸位！</w:t>
       </w:r>
     </w:p>
@@ -207,7 +246,7 @@
               <a:graphicData uri="http://schemas.openxmlformats.org/drawingml/2006/picture">
                 <pic:pic>
                   <pic:nvPicPr>
-                    <pic:cNvPr id="0" name="step2.png"/>
+                    <pic:cNvPr id="0" name="image2.png"/>
                     <pic:cNvPicPr/>
                   </pic:nvPicPr>
                   <pic:blipFill>
@@ -237,6 +276,7 @@
       </w:pPr>
       <w:r>
         <w:rPr>
+          <w:rFonts w:ascii="Microsoft JhengHei" w:hAnsi="Microsoft JhengHei"/>
           <w:b/>
           <w:color w:val="C00000"/>
           <w:sz w:val="19"/>
@@ -260,6 +300,9 @@
     </w:p>
     <w:p>
       <w:r>
+        <w:rPr>
+          <w:rFonts w:ascii="Microsoft JhengHei" w:hAnsi="Microsoft JhengHei"/>
+        </w:rPr>
         <w:t>填錯資料時無需逐一退格刪除！單列填錯點擊右側紅色「清空」按鈕；整體重填點擊右上角「清除全部資料 (全清)」按鈕即可秒級復原。</w:t>
       </w:r>
     </w:p>
@@ -280,7 +323,7 @@
               <a:graphicData uri="http://schemas.openxmlformats.org/drawingml/2006/picture">
                 <pic:pic>
                   <pic:nvPicPr>
-                    <pic:cNvPr id="0" name="step3.png"/>
+                    <pic:cNvPr id="0" name="image3.png"/>
                     <pic:cNvPicPr/>
                   </pic:nvPicPr>
                   <pic:blipFill>
@@ -310,6 +353,7 @@
       </w:pPr>
       <w:r>
         <w:rPr>
+          <w:rFonts w:ascii="Microsoft JhengHei" w:hAnsi="Microsoft JhengHei"/>
           <w:b/>
           <w:color w:val="C00000"/>
           <w:sz w:val="19"/>
@@ -328,11 +372,91 @@
           <w:color w:val="1B5E20"/>
           <w:sz w:val="25"/>
         </w:rPr>
-        <w:t>【步驟 4】Excel 倒數筆數由下往上智慧擷取</w:t>
+        <w:t>【步驟 4】上傳 COA 檢驗截圖與自動 OCR 辨識貼入</w:t>
       </w:r>
     </w:p>
     <w:p>
       <w:r>
+        <w:rPr>
+          <w:rFonts w:ascii="Microsoft JhengHei" w:hAnsi="Microsoft JhengHei"/>
+        </w:rPr>
+        <w:t>點擊頂部橘色「上傳 COA 截圖」按鈕，可一次選取多張當日檢驗截圖檔。產出三合一單時，系統自動透過 OCR 引擎解析對應批號，將檢驗表頭與數據自動裁切並精確嵌入三合一單 F5 儲存格！</w:t>
+      </w:r>
+    </w:p>
+    <w:p>
+      <w:pPr>
+        <w:spacing w:before="120" w:after="40"/>
+        <w:jc w:val="center"/>
+      </w:pPr>
+      <w:r>
+        <w:drawing>
+          <wp:inline xmlns:a="http://schemas.openxmlformats.org/drawingml/2006/main" xmlns:pic="http://schemas.openxmlformats.org/drawingml/2006/picture">
+            <wp:extent cx="5669280" cy="1034644"/>
+            <wp:docPr id="4" name="Picture 4"/>
+            <wp:cNvGraphicFramePr>
+              <a:graphicFrameLocks noChangeAspect="1"/>
+            </wp:cNvGraphicFramePr>
+            <a:graphic>
+              <a:graphicData uri="http://schemas.openxmlformats.org/drawingml/2006/picture">
+                <pic:pic>
+                  <pic:nvPicPr>
+                    <pic:cNvPr id="0" name="image_coa.png"/>
+                    <pic:cNvPicPr/>
+                  </pic:nvPicPr>
+                  <pic:blipFill>
+                    <a:blip r:embed="rId12"/>
+                    <a:stretch>
+                      <a:fillRect/>
+                    </a:stretch>
+                  </pic:blipFill>
+                  <pic:spPr>
+                    <a:xfrm>
+                      <a:off x="0" y="0"/>
+                      <a:ext cx="5669280" cy="1034644"/>
+                    </a:xfrm>
+                    <a:prstGeom prst="rect"/>
+                  </pic:spPr>
+                </pic:pic>
+              </a:graphicData>
+            </a:graphic>
+          </wp:inline>
+        </w:drawing>
+      </w:r>
+    </w:p>
+    <w:p>
+      <w:pPr>
+        <w:spacing w:after="200"/>
+        <w:jc w:val="center"/>
+      </w:pPr>
+      <w:r>
+        <w:rPr>
+          <w:rFonts w:ascii="Microsoft JhengHei" w:hAnsi="Microsoft JhengHei"/>
+          <w:b/>
+          <w:color w:val="C00000"/>
+          <w:sz w:val="19"/>
+        </w:rPr>
+        <w:t>▲ 圖 4：頂部『上傳 COA 截圖』按鈕位置示意圖</w:t>
+      </w:r>
+    </w:p>
+    <w:p>
+      <w:pPr>
+        <w:spacing w:before="200" w:after="80"/>
+      </w:pPr>
+      <w:r>
+        <w:rPr>
+          <w:rFonts w:ascii="Microsoft JhengHei" w:hAnsi="Microsoft JhengHei"/>
+          <w:b/>
+          <w:color w:val="1B5E20"/>
+          <w:sz w:val="25"/>
+        </w:rPr>
+        <w:t>【步驟 5】Excel 倒數筆數由下往上智慧擷取</w:t>
+      </w:r>
+    </w:p>
+    <w:p>
+      <w:r>
+        <w:rPr>
+          <w:rFonts w:ascii="Microsoft JhengHei" w:hAnsi="Microsoft JhengHei"/>
+        </w:rPr>
         <w:t>點擊「從 Excel 匯入」時，系統會彈出 750px 寬版視窗，預設從檔案最後一筆由下往上擷取最新的 5 筆、10 筆或全部資料，防呆避免讀到歷史舊資料！</w:t>
       </w:r>
     </w:p>
@@ -345,7 +469,7 @@
         <w:drawing>
           <wp:inline xmlns:a="http://schemas.openxmlformats.org/drawingml/2006/main" xmlns:pic="http://schemas.openxmlformats.org/drawingml/2006/picture">
             <wp:extent cx="5669280" cy="2267712"/>
-            <wp:docPr id="4" name="Picture 4"/>
+            <wp:docPr id="5" name="Picture 5"/>
             <wp:cNvGraphicFramePr>
               <a:graphicFrameLocks noChangeAspect="1"/>
             </wp:cNvGraphicFramePr>
@@ -353,11 +477,11 @@
               <a:graphicData uri="http://schemas.openxmlformats.org/drawingml/2006/picture">
                 <pic:pic>
                   <pic:nvPicPr>
-                    <pic:cNvPr id="0" name="step4.png"/>
+                    <pic:cNvPr id="0" name="image4.png"/>
                     <pic:cNvPicPr/>
                   </pic:nvPicPr>
                   <pic:blipFill>
-                    <a:blip r:embed="rId12"/>
+                    <a:blip r:embed="rId13"/>
                     <a:stretch>
                       <a:fillRect/>
                     </a:stretch>
@@ -383,11 +507,12 @@
       </w:pPr>
       <w:r>
         <w:rPr>
+          <w:rFonts w:ascii="Microsoft JhengHei" w:hAnsi="Microsoft JhengHei"/>
           <w:b/>
           <w:color w:val="C00000"/>
           <w:sz w:val="19"/>
         </w:rPr>
-        <w:t>▲ 圖 4：由下往上倒數擷取與即時預覽對話框示意圖</w:t>
+        <w:t>▲ 圖 5：由下往上倒數擷取與即時預覽對話框示意圖</w:t>
       </w:r>
     </w:p>
     <w:p>
@@ -401,11 +526,14 @@
           <w:color w:val="1B5E20"/>
           <w:sz w:val="25"/>
         </w:rPr>
-        <w:t>【步驟 5】還原既有通知表與點對點修正到廠時間</w:t>
+        <w:t>【步驟 6】還原既有通知表與點對點修正到廠時間</w:t>
       </w:r>
     </w:p>
     <w:p>
       <w:r>
+        <w:rPr>
+          <w:rFonts w:ascii="Microsoft JhengHei" w:hAnsi="Microsoft JhengHei"/>
+        </w:rPr>
         <w:t>當下午需要修正上午產生的通知表時，點擊「載入既有『運輸通知表』修訂」（預設開啟當天資料夾）。一鍵還原所有原始列號與 10 碼批號，只需在該列輸入「修正到廠時間」即可產出併排修正卡片！</w:t>
       </w:r>
     </w:p>
@@ -418,7 +546,7 @@
         <w:drawing>
           <wp:inline xmlns:a="http://schemas.openxmlformats.org/drawingml/2006/main" xmlns:pic="http://schemas.openxmlformats.org/drawingml/2006/picture">
             <wp:extent cx="5669280" cy="1629918"/>
-            <wp:docPr id="5" name="Picture 5"/>
+            <wp:docPr id="6" name="Picture 6"/>
             <wp:cNvGraphicFramePr>
               <a:graphicFrameLocks noChangeAspect="1"/>
             </wp:cNvGraphicFramePr>
@@ -426,11 +554,11 @@
               <a:graphicData uri="http://schemas.openxmlformats.org/drawingml/2006/picture">
                 <pic:pic>
                   <pic:nvPicPr>
-                    <pic:cNvPr id="0" name="step5.png"/>
+                    <pic:cNvPr id="0" name="image5.png"/>
                     <pic:cNvPicPr/>
                   </pic:nvPicPr>
                   <pic:blipFill>
-                    <a:blip r:embed="rId13"/>
+                    <a:blip r:embed="rId14"/>
                     <a:stretch>
                       <a:fillRect/>
                     </a:stretch>
@@ -456,11 +584,12 @@
       </w:pPr>
       <w:r>
         <w:rPr>
+          <w:rFonts w:ascii="Microsoft JhengHei" w:hAnsi="Microsoft JhengHei"/>
           <w:b/>
           <w:color w:val="C00000"/>
           <w:sz w:val="19"/>
         </w:rPr>
-        <w:t>▲ 圖 5：載入既有通知表與填寫修正時間示意圖</w:t>
+        <w:t>▲ 圖 6：載入既有通知表與填寫修正時間示意圖</w:t>
       </w:r>
     </w:p>
     <w:p>
@@ -474,11 +603,14 @@
           <w:color w:val="1B5E20"/>
           <w:sz w:val="25"/>
         </w:rPr>
-        <w:t>【步驟 6】一鍵產生報表與全新【槽號】檔名格式</w:t>
+        <w:t>【步驟 7】一鍵產生報表與全新【槽號】檔名格式</w:t>
       </w:r>
     </w:p>
     <w:p>
       <w:r>
+        <w:rPr>
+          <w:rFonts w:ascii="Microsoft JhengHei" w:hAnsi="Microsoft JhengHei"/>
+        </w:rPr>
         <w:t>勾選欲產生的報表種類後，點擊下方「開始批次產生 Excel 報表」。三合一單最新檔名規格加入【槽號】，徹底解決同天同地點出車檔案覆蓋的問題！</w:t>
       </w:r>
     </w:p>
@@ -491,7 +623,7 @@
         <w:drawing>
           <wp:inline xmlns:a="http://schemas.openxmlformats.org/drawingml/2006/main" xmlns:pic="http://schemas.openxmlformats.org/drawingml/2006/picture">
             <wp:extent cx="5669280" cy="1559052"/>
-            <wp:docPr id="6" name="Picture 6"/>
+            <wp:docPr id="7" name="Picture 7"/>
             <wp:cNvGraphicFramePr>
               <a:graphicFrameLocks noChangeAspect="1"/>
             </wp:cNvGraphicFramePr>
@@ -499,11 +631,11 @@
               <a:graphicData uri="http://schemas.openxmlformats.org/drawingml/2006/picture">
                 <pic:pic>
                   <pic:nvPicPr>
-                    <pic:cNvPr id="0" name="step6.png"/>
+                    <pic:cNvPr id="0" name="image6.png"/>
                     <pic:cNvPicPr/>
                   </pic:nvPicPr>
                   <pic:blipFill>
-                    <a:blip r:embed="rId14"/>
+                    <a:blip r:embed="rId15"/>
                     <a:stretch>
                       <a:fillRect/>
                     </a:stretch>
@@ -529,11 +661,12 @@
       </w:pPr>
       <w:r>
         <w:rPr>
+          <w:rFonts w:ascii="Microsoft JhengHei" w:hAnsi="Microsoft JhengHei"/>
           <w:b/>
           <w:color w:val="C00000"/>
           <w:sz w:val="19"/>
         </w:rPr>
-        <w:t>▲ 圖 6：一鍵批次產生報表與槽號檔名格式示意圖</w:t>
+        <w:t>▲ 圖 7：一鍵批次產生報表與槽號檔名格式示意圖</w:t>
       </w:r>
     </w:p>
     <w:p>
@@ -565,12 +698,12 @@
       <w:tr>
         <w:tc>
           <w:tcPr>
-            <w:tcW w:type="dxa" w:w="2592"/>
+            <w:tcW w:type="dxa" w:w="2160"/>
             <w:shd w:fill="002060"/>
             <w:tcMar>
               <w:top w:w="100" w:type="dxa"/>
+              <w:left w:w="120" w:type="dxa"/>
               <w:bottom w:w="100" w:type="dxa"/>
-              <w:left w:w="120" w:type="dxa"/>
               <w:right w:w="120" w:type="dxa"/>
             </w:tcMar>
           </w:tcPr>
@@ -580,6 +713,7 @@
             </w:pPr>
             <w:r>
               <w:rPr>
+                <w:rFonts w:ascii="Microsoft JhengHei" w:hAnsi="Microsoft JhengHei"/>
                 <w:b/>
                 <w:color w:val="FFFFFF"/>
               </w:rPr>
@@ -593,8 +727,8 @@
             <w:shd w:fill="002060"/>
             <w:tcMar>
               <w:top w:w="100" w:type="dxa"/>
+              <w:left w:w="120" w:type="dxa"/>
               <w:bottom w:w="100" w:type="dxa"/>
-              <w:left w:w="120" w:type="dxa"/>
               <w:right w:w="120" w:type="dxa"/>
             </w:tcMar>
           </w:tcPr>
@@ -604,6 +738,7 @@
             </w:pPr>
             <w:r>
               <w:rPr>
+                <w:rFonts w:ascii="Microsoft JhengHei" w:hAnsi="Microsoft JhengHei"/>
                 <w:b/>
                 <w:color w:val="FFFFFF"/>
               </w:rPr>
@@ -613,12 +748,12 @@
         </w:tc>
         <w:tc>
           <w:tcPr>
-            <w:tcW w:type="dxa" w:w="2880"/>
+            <w:tcW w:type="dxa" w:w="3312"/>
             <w:shd w:fill="002060"/>
             <w:tcMar>
               <w:top w:w="100" w:type="dxa"/>
+              <w:left w:w="120" w:type="dxa"/>
               <w:bottom w:w="100" w:type="dxa"/>
-              <w:left w:w="120" w:type="dxa"/>
               <w:right w:w="120" w:type="dxa"/>
             </w:tcMar>
           </w:tcPr>
@@ -628,6 +763,7 @@
             </w:pPr>
             <w:r>
               <w:rPr>
+                <w:rFonts w:ascii="Microsoft JhengHei" w:hAnsi="Microsoft JhengHei"/>
                 <w:b/>
                 <w:color w:val="FFFFFF"/>
               </w:rPr>
@@ -639,12 +775,12 @@
       <w:tr>
         <w:tc>
           <w:tcPr>
-            <w:tcW w:type="dxa" w:w="2592"/>
+            <w:tcW w:type="dxa" w:w="2160"/>
             <w:shd w:fill="FFFFFF"/>
             <w:tcMar>
               <w:top w:w="80" w:type="dxa"/>
+              <w:left w:w="120" w:type="dxa"/>
               <w:bottom w:w="80" w:type="dxa"/>
-              <w:left w:w="120" w:type="dxa"/>
               <w:right w:w="120" w:type="dxa"/>
             </w:tcMar>
           </w:tcPr>
@@ -654,6 +790,7 @@
             </w:pPr>
             <w:r>
               <w:rPr>
+                <w:rFonts w:ascii="Microsoft JhengHei" w:hAnsi="Microsoft JhengHei"/>
                 <w:b/>
               </w:rPr>
               <w:t>獨立三合一單</w:t>
@@ -666,31 +803,37 @@
             <w:shd w:fill="FFFFFF"/>
             <w:tcMar>
               <w:top w:w="80" w:type="dxa"/>
+              <w:left w:w="120" w:type="dxa"/>
               <w:bottom w:w="80" w:type="dxa"/>
-              <w:left w:w="120" w:type="dxa"/>
               <w:right w:w="120" w:type="dxa"/>
             </w:tcMar>
           </w:tcPr>
           <w:p>
             <w:r>
+              <w:rPr>
+                <w:rFonts w:ascii="Microsoft JhengHei" w:hAnsi="Microsoft JhengHei"/>
+              </w:rPr>
               <w:t>[出貨日期]. [地點]_[槽號]_台積電槽車barcode三合一單.xlsx</w:t>
             </w:r>
           </w:p>
         </w:tc>
         <w:tc>
           <w:tcPr>
-            <w:tcW w:type="dxa" w:w="2880"/>
+            <w:tcW w:type="dxa" w:w="3312"/>
             <w:shd w:fill="FFFFFF"/>
             <w:tcMar>
               <w:top w:w="80" w:type="dxa"/>
+              <w:left w:w="120" w:type="dxa"/>
               <w:bottom w:w="80" w:type="dxa"/>
-              <w:left w:w="120" w:type="dxa"/>
               <w:right w:w="120" w:type="dxa"/>
             </w:tcMar>
           </w:tcPr>
           <w:p>
             <w:r>
-              <w:t>例如：2026.8.20. 18P3B_E319_台積電槽車barcode三合一單.xlsx</w:t>
+              <w:rPr>
+                <w:rFonts w:ascii="Microsoft JhengHei" w:hAnsi="Microsoft JhengHei"/>
+              </w:rPr>
+              <w:t>例如：2026.8.20. 18P3B_E319_台積電槽車barcode三合一單.xlsx（含自動 QR Code 與 COA 檢驗截圖嵌入）</w:t>
             </w:r>
           </w:p>
         </w:tc>
@@ -698,12 +841,12 @@
       <w:tr>
         <w:tc>
           <w:tcPr>
-            <w:tcW w:type="dxa" w:w="2592"/>
+            <w:tcW w:type="dxa" w:w="2160"/>
             <w:shd w:fill="F9F9F9"/>
             <w:tcMar>
               <w:top w:w="80" w:type="dxa"/>
+              <w:left w:w="120" w:type="dxa"/>
               <w:bottom w:w="80" w:type="dxa"/>
-              <w:left w:w="120" w:type="dxa"/>
               <w:right w:w="120" w:type="dxa"/>
             </w:tcMar>
           </w:tcPr>
@@ -713,6 +856,7 @@
             </w:pPr>
             <w:r>
               <w:rPr>
+                <w:rFonts w:ascii="Microsoft JhengHei" w:hAnsi="Microsoft JhengHei"/>
                 <w:b/>
               </w:rPr>
               <w:t>運輸通知表</w:t>
@@ -725,31 +869,37 @@
             <w:shd w:fill="F9F9F9"/>
             <w:tcMar>
               <w:top w:w="80" w:type="dxa"/>
+              <w:left w:w="120" w:type="dxa"/>
               <w:bottom w:w="80" w:type="dxa"/>
-              <w:left w:w="120" w:type="dxa"/>
               <w:right w:w="120" w:type="dxa"/>
             </w:tcMar>
           </w:tcPr>
           <w:p>
             <w:r>
+              <w:rPr>
+                <w:rFonts w:ascii="Microsoft JhengHei" w:hAnsi="Microsoft JhengHei"/>
+              </w:rPr>
               <w:t>運輸通知表.xlsx</w:t>
             </w:r>
           </w:p>
         </w:tc>
         <w:tc>
           <w:tcPr>
-            <w:tcW w:type="dxa" w:w="2880"/>
+            <w:tcW w:type="dxa" w:w="3312"/>
             <w:shd w:fill="F9F9F9"/>
             <w:tcMar>
               <w:top w:w="80" w:type="dxa"/>
+              <w:left w:w="120" w:type="dxa"/>
               <w:bottom w:w="80" w:type="dxa"/>
-              <w:left w:w="120" w:type="dxa"/>
               <w:right w:w="120" w:type="dxa"/>
             </w:tcMar>
           </w:tcPr>
           <w:p>
             <w:r>
-              <w:t>若當天已存在自動接力寫入，併排顯示修正通知</w:t>
+              <w:rPr>
+                <w:rFonts w:ascii="Microsoft JhengHei" w:hAnsi="Microsoft JhengHei"/>
+              </w:rPr>
+              <w:t>若當天已存在自動接力寫入，併排顯示修正通知（支援紅字加粗與刪除線）</w:t>
             </w:r>
           </w:p>
         </w:tc>
@@ -757,12 +907,12 @@
       <w:tr>
         <w:tc>
           <w:tcPr>
-            <w:tcW w:type="dxa" w:w="2592"/>
+            <w:tcW w:type="dxa" w:w="2160"/>
             <w:shd w:fill="FFFFFF"/>
             <w:tcMar>
               <w:top w:w="80" w:type="dxa"/>
+              <w:left w:w="120" w:type="dxa"/>
               <w:bottom w:w="80" w:type="dxa"/>
-              <w:left w:w="120" w:type="dxa"/>
               <w:right w:w="120" w:type="dxa"/>
             </w:tcMar>
           </w:tcPr>
@@ -772,6 +922,7 @@
             </w:pPr>
             <w:r>
               <w:rPr>
+                <w:rFonts w:ascii="Microsoft JhengHei" w:hAnsi="Microsoft JhengHei"/>
                 <w:b/>
               </w:rPr>
               <w:t>歸檔資料夾</w:t>
@@ -784,36 +935,196 @@
             <w:shd w:fill="FFFFFF"/>
             <w:tcMar>
               <w:top w:w="80" w:type="dxa"/>
+              <w:left w:w="120" w:type="dxa"/>
               <w:bottom w:w="80" w:type="dxa"/>
-              <w:left w:w="120" w:type="dxa"/>
               <w:right w:w="120" w:type="dxa"/>
             </w:tcMar>
           </w:tcPr>
           <w:p>
             <w:r>
+              <w:rPr>
+                <w:rFonts w:ascii="Microsoft JhengHei" w:hAnsi="Microsoft JhengHei"/>
+              </w:rPr>
               <w:t>三合一單輸出_YYYYMMDD</w:t>
             </w:r>
           </w:p>
         </w:tc>
         <w:tc>
           <w:tcPr>
-            <w:tcW w:type="dxa" w:w="2880"/>
+            <w:tcW w:type="dxa" w:w="3312"/>
             <w:shd w:fill="FFFFFF"/>
             <w:tcMar>
               <w:top w:w="80" w:type="dxa"/>
+              <w:left w:w="120" w:type="dxa"/>
               <w:bottom w:w="80" w:type="dxa"/>
-              <w:left w:w="120" w:type="dxa"/>
               <w:right w:w="120" w:type="dxa"/>
             </w:tcMar>
           </w:tcPr>
           <w:p>
             <w:r>
+              <w:rPr>
+                <w:rFonts w:ascii="Microsoft JhengHei" w:hAnsi="Microsoft JhengHei"/>
+              </w:rPr>
               <w:t>例如：三合一單輸出_20260820，一天集中於同一資料夾</w:t>
             </w:r>
           </w:p>
         </w:tc>
       </w:tr>
     </w:tbl>
+    <w:p>
+      <w:pPr>
+        <w:spacing w:before="320" w:after="120"/>
+      </w:pPr>
+      <w:r>
+        <w:rPr>
+          <w:rFonts w:ascii="Microsoft JhengHei" w:hAnsi="Microsoft JhengHei"/>
+          <w:b/>
+          <w:color w:val="002060"/>
+          <w:sz w:val="30"/>
+        </w:rPr>
+        <w:t>四、 常見問題與故障排除 (Troubleshooting &amp; FAQ)</w:t>
+      </w:r>
+    </w:p>
+    <w:p>
+      <w:pPr>
+        <w:spacing w:before="160" w:after="40"/>
+      </w:pPr>
+      <w:r>
+        <w:rPr>
+          <w:rFonts w:ascii="Microsoft JhengHei" w:hAnsi="Microsoft JhengHei"/>
+          <w:b/>
+          <w:color w:val="00509E"/>
+          <w:sz w:val="23"/>
+        </w:rPr>
+        <w:t>Q1：產出時跳出「批號長度錯誤」或槽號未自動帶出？</w:t>
+      </w:r>
+    </w:p>
+    <w:p>
+      <w:pPr>
+        <w:spacing w:before="0" w:after="120"/>
+      </w:pPr>
+      <w:r>
+        <w:rPr>
+          <w:rFonts w:ascii="Microsoft JhengHei" w:hAnsi="Microsoft JhengHei"/>
+          <w:sz w:val="21"/>
+        </w:rPr>
+        <w:t>【原因與排除】台積電槽車批號嚴格規定為 10 碼（英數字）。請檢查輸入框內是否有前後多打空格、少碼或誤貼。修正為完整 10 碼後，系統會自動在「槽號」欄位帶出 3~4 碼對應槽號。</w:t>
+      </w:r>
+    </w:p>
+    <w:p>
+      <w:pPr>
+        <w:spacing w:before="160" w:after="40"/>
+      </w:pPr>
+      <w:r>
+        <w:rPr>
+          <w:rFonts w:ascii="Microsoft JhengHei" w:hAnsi="Microsoft JhengHei"/>
+          <w:b/>
+          <w:color w:val="00509E"/>
+          <w:sz w:val="23"/>
+        </w:rPr>
+        <w:t>Q2：地點輸入後「長代號」欄位顯示紅色「對照表中找不到」？</w:t>
+      </w:r>
+    </w:p>
+    <w:p>
+      <w:pPr>
+        <w:spacing w:before="0" w:after="120"/>
+      </w:pPr>
+      <w:r>
+        <w:rPr>
+          <w:rFonts w:ascii="Microsoft JhengHei" w:hAnsi="Microsoft JhengHei"/>
+          <w:sz w:val="21"/>
+        </w:rPr>
+        <w:t>【原因與排除】表示輸入之地點代號尚未登錄在『地點代號對照表.xlsx』中。排除步驟：</w:t>
+        <w:br/>
+        <w:t>1. 開啟軟體同目錄下的『地點代號對照表.xlsx』檔案。</w:t>
+        <w:br/>
+        <w:t>2. 在下方新增對應之地點名稱與長代號後儲存檔案。</w:t>
+        <w:br/>
+        <w:t>3. 回到軟體視窗點擊頂部「重新載入對照表」按鈕即可立即生效，無需關閉重啟程式！</w:t>
+      </w:r>
+    </w:p>
+    <w:p>
+      <w:pPr>
+        <w:spacing w:before="160" w:after="40"/>
+      </w:pPr>
+      <w:r>
+        <w:rPr>
+          <w:rFonts w:ascii="Microsoft JhengHei" w:hAnsi="Microsoft JhengHei"/>
+          <w:b/>
+          <w:color w:val="00509E"/>
+          <w:sz w:val="23"/>
+        </w:rPr>
+        <w:t>Q3：COA 檢驗截圖上傳後，產出之三合一單 F5 儲存格未帶出檢驗圖？</w:t>
+      </w:r>
+    </w:p>
+    <w:p>
+      <w:pPr>
+        <w:spacing w:before="0" w:after="120"/>
+      </w:pPr>
+      <w:r>
+        <w:rPr>
+          <w:rFonts w:ascii="Microsoft JhengHei" w:hAnsi="Microsoft JhengHei"/>
+          <w:sz w:val="21"/>
+        </w:rPr>
+        <w:t>【原因與排除】請依序確認以下兩點：</w:t>
+        <w:br/>
+        <w:t>1. 確認截圖清晰度：COA 截圖內的「批號」文字請保持清晰、勿過度壓縮或遮蔽。</w:t>
+        <w:br/>
+        <w:t>2. 確認 OCR 引擎已安裝：點擊「上傳 COA 截圖」時若系統提示尚未安裝 Tesseract-OCR，請依彈出視窗引導下載安裝於預設路徑即可自動啟用。</w:t>
+      </w:r>
+    </w:p>
+    <w:p>
+      <w:pPr>
+        <w:spacing w:before="160" w:after="40"/>
+      </w:pPr>
+      <w:r>
+        <w:rPr>
+          <w:rFonts w:ascii="Microsoft JhengHei" w:hAnsi="Microsoft JhengHei"/>
+          <w:b/>
+          <w:color w:val="00509E"/>
+          <w:sz w:val="23"/>
+        </w:rPr>
+        <w:t>Q4：點擊「開始批次產生 Excel 報表」時跳出「Permission Denied (權限遭拒)」？</w:t>
+      </w:r>
+    </w:p>
+    <w:p>
+      <w:pPr>
+        <w:spacing w:before="0" w:after="120"/>
+      </w:pPr>
+      <w:r>
+        <w:rPr>
+          <w:rFonts w:ascii="Microsoft JhengHei" w:hAnsi="Microsoft JhengHei"/>
+          <w:sz w:val="21"/>
+        </w:rPr>
+        <w:t>【原因與排除】通常是因為同名的 Excel 檔案目前正被人員以 Microsoft Excel 開啟檢視中，導致檔案被作業系統鎖定無法覆寫。排除方法：請先將開啟中的 Excel 檔案存檔並關閉，再重新點擊產生按鈕即可。</w:t>
+      </w:r>
+    </w:p>
+    <w:p>
+      <w:pPr>
+        <w:spacing w:before="160" w:after="40"/>
+      </w:pPr>
+      <w:r>
+        <w:rPr>
+          <w:rFonts w:ascii="Microsoft JhengHei" w:hAnsi="Microsoft JhengHei"/>
+          <w:b/>
+          <w:color w:val="00509E"/>
+          <w:sz w:val="23"/>
+        </w:rPr>
+        <w:t>Q5：同天多次出車，舊的三合一單是否會被後續產生的檔案覆蓋？</w:t>
+      </w:r>
+    </w:p>
+    <w:p>
+      <w:pPr>
+        <w:spacing w:before="0" w:after="120"/>
+      </w:pPr>
+      <w:r>
+        <w:rPr>
+          <w:rFonts w:ascii="Microsoft JhengHei" w:hAnsi="Microsoft JhengHei"/>
+          <w:sz w:val="21"/>
+        </w:rPr>
+        <w:t>【原因與排除】不會！系統已全面導入最新「日期 + 地點 + 槽號」防覆蓋檔名格式（例如：2026.8.20. 18P3B_E319_台積電槽車barcode三合一單.xlsx）。只要槽號或地點不同，即使在同一天內多次產出也會獨立存檔，徹底解決檔案覆蓋問題。</w:t>
+      </w:r>
+    </w:p>
     <w:sectPr>
       <w:pgSz w:w="12240" w:h="15840"/>
       <w:pgMar w:top="1152" w:right="1152" w:bottom="1152" w:left="1152" w:header="720" w:footer="720" w:gutter="0"/>

</xml_diff>